<commit_message>
Update documentation to reflect hidden AI features
</commit_message>
<xml_diff>
--- a/PROJECT_DOCUMENTATION.docx
+++ b/PROJECT_DOCUMENTATION.docx
@@ -323,21 +323,7 @@
           <w:sz w:val="21"/>
           <w:szCs w:val="21"/>
         </w:rPr>
-        <w:t xml:space="preserve">   4.8  AI Triage Page</w:t>
-      </w:r>
-    </w:p>
-    <w:p>
-      <w:pPr>
-        <w:spacing w:after="120"/>
-      </w:pPr>
-      <w:r>
-        <w:rPr>
-          <w:rFonts w:ascii="Calibri" w:cs="Calibri" w:eastAsia="Calibri" w:hAnsi="Calibri"/>
-          <w:color w:val="475569"/>
-          <w:sz w:val="21"/>
-          <w:szCs w:val="21"/>
-        </w:rPr>
-        <w:t xml:space="preserve">   4.9  Live News Feed Page</w:t>
+        <w:t xml:space="preserve">   4.8  Live News Feed Page</w:t>
       </w:r>
     </w:p>
     <w:p>
@@ -478,25 +464,6 @@
           <w:sz w:val="21"/>
           <w:szCs w:val="21"/>
         </w:rPr>
-        <w:t xml:space="preserve">Automates Emergency Dispatch: When a citizen submits a crime complaint online, an NLP (Natural Language Processing) AI reads the text, understands the severity, and assigns an automated priority label (CRITICAL, HIGH, MEDIUM, LOW) in real-time.</w:t>
-      </w:r>
-    </w:p>
-    <w:p>
-      <w:pPr>
-        <w:pStyle w:val="ListParagraph"/>
-        <w:numPr>
-          <w:ilvl w:val="0"/>
-          <w:numId w:val="1"/>
-        </w:numPr>
-        <w:spacing w:after="80"/>
-      </w:pPr>
-      <w:r>
-        <w:rPr>
-          <w:rFonts w:ascii="Calibri" w:cs="Calibri" w:eastAsia="Calibri" w:hAnsi="Calibri"/>
-          <w:color w:val="475569"/>
-          <w:sz w:val="21"/>
-          <w:szCs w:val="21"/>
-        </w:rPr>
         <w:t xml:space="preserve">Pinpoints Danger Zones: Uses the K-Means Clustering algorithm to assign unbiased Safety Scores (0-100) to each state and maps crime hotspot districts on an interactive map.</w:t>
       </w:r>
     </w:p>
@@ -690,16 +657,16 @@
           <w:sz w:val="21"/>
           <w:szCs w:val="21"/>
         </w:rPr>
-        <w:t xml:space="preserve">ML Solution: </w:t>
-      </w:r>
-      <w:r>
-        <w:rPr>
-          <w:rFonts w:ascii="Calibri" w:cs="Calibri" w:eastAsia="Calibri" w:hAnsi="Calibri"/>
-          <w:color w:val="475569"/>
-          <w:sz w:val="21"/>
-          <w:szCs w:val="21"/>
-        </w:rPr>
-        <w:t xml:space="preserve">The Smart Dispatch AI (Multinomial Naive Bayes classifier) reads the complaint text the moment it is submitted, categorizes it (e.g., "Murder", "Theft", "Assault"), and pushes life-threatening emergencies to the top of the screen with a flashing CRITICAL badge.</w:t>
+        <w:t xml:space="preserve">Digital Solution: </w:t>
+      </w:r>
+      <w:r>
+        <w:rPr>
+          <w:rFonts w:ascii="Calibri" w:cs="Calibri" w:eastAsia="Calibri" w:hAnsi="Calibri"/>
+          <w:color w:val="475569"/>
+          <w:sz w:val="21"/>
+          <w:szCs w:val="21"/>
+        </w:rPr>
+        <w:t xml:space="preserve">The system provides an organized digital reporting portal, allowing dispatchers to view timestamped, structured complaints instantly instead of sorting through paper forms or chaotic phone logs.</w:t>
       </w:r>
     </w:p>
     <w:p>
@@ -958,7 +925,7 @@
           <w:sz w:val="21"/>
           <w:szCs w:val="21"/>
         </w:rPr>
-        <w:t xml:space="preserve">ML Libraries: scikit-learn (Random Forest, Naive Bayes, K-Means), pandas, numpy, joblib</w:t>
+        <w:t xml:space="preserve">ML Libraries: scikit-learn (Random Forest, K-Means), pandas, numpy, joblib</w:t>
       </w:r>
     </w:p>
     <w:p>
@@ -1574,25 +1541,6 @@
           <w:sz w:val="21"/>
           <w:szCs w:val="21"/>
         </w:rPr>
-        <w:t xml:space="preserve">OSINT Alert Banners: If the AI detects that any state is projected to have &gt;10% crime growth next year, it automatically pushes a flashing SYSTEM ALERT banner with the state name and projected growth percentage.</w:t>
-      </w:r>
-    </w:p>
-    <w:p>
-      <w:pPr>
-        <w:pStyle w:val="ListParagraph"/>
-        <w:numPr>
-          <w:ilvl w:val="0"/>
-          <w:numId w:val="1"/>
-        </w:numPr>
-        <w:spacing w:after="80"/>
-      </w:pPr>
-      <w:r>
-        <w:rPr>
-          <w:rFonts w:ascii="Calibri" w:cs="Calibri" w:eastAsia="Calibri" w:hAnsi="Calibri"/>
-          <w:color w:val="475569"/>
-          <w:sz w:val="21"/>
-          <w:szCs w:val="21"/>
-        </w:rPr>
         <w:t xml:space="preserve">Stat Cards: Four summary cards showing — Total States Tracked (36), Total IPC Crimes (latest year), Total SLL Crimes, and Year-over-Year change percentage.</w:t>
       </w:r>
     </w:p>
@@ -2522,7 +2470,7 @@
           <w:sz w:val="21"/>
           <w:szCs w:val="21"/>
         </w:rPr>
-        <w:t xml:space="preserve">AI Auto-Processing: When the user clicks Submit, the text description is automatically sent to the Flask ML server, which runs the NLP classifier to determine the crime category and priority level.</w:t>
+        <w:t xml:space="preserve">Digital Processing: When the user clicks Submit, the complaint is securely stored in the database for police review.</w:t>
       </w:r>
     </w:p>
     <w:p>
@@ -2578,7 +2526,7 @@
           <w:sz w:val="26"/>
           <w:szCs w:val="26"/>
         </w:rPr>
-        <w:t xml:space="preserve">4.8 — AI Triage Page (Smart Dispatch)</w:t>
+        <w:t xml:space="preserve">4.8 — Live News Feed Page</w:t>
       </w:r>
     </w:p>
     <w:p>
@@ -2609,7 +2557,7 @@
           <w:sz w:val="21"/>
           <w:szCs w:val="21"/>
         </w:rPr>
-        <w:t xml:space="preserve">This is the mission-critical page for police dispatchers. It shows all citizen complaints automatically sorted by AI-assigned urgency, ensuring life-threatening emergencies are never missed.</w:t>
+        <w:t xml:space="preserve">Intelligence agencies need real-time situational awareness. This page provides a continuously updated feed of crime-related news from multiple global and Indian news sources.</w:t>
       </w:r>
     </w:p>
     <w:p>
@@ -2645,64 +2593,45 @@
           <w:sz w:val="21"/>
           <w:szCs w:val="21"/>
         </w:rPr>
-        <w:t xml:space="preserve">Emergency Banner: If any complaint is labeled CRITICAL by the AI, a prominent red alert appears at the top: "EMERGENCY DISPATCH: X CRITICAL priority complaint(s) require immediate action."</w:t>
-      </w:r>
-    </w:p>
-    <w:p>
-      <w:pPr>
-        <w:pStyle w:val="ListParagraph"/>
-        <w:numPr>
-          <w:ilvl w:val="0"/>
-          <w:numId w:val="1"/>
-        </w:numPr>
-        <w:spacing w:after="80"/>
-      </w:pPr>
-      <w:r>
-        <w:rPr>
-          <w:rFonts w:ascii="Calibri" w:cs="Calibri" w:eastAsia="Calibri" w:hAnsi="Calibri"/>
-          <w:color w:val="475569"/>
-          <w:sz w:val="21"/>
-          <w:szCs w:val="21"/>
-        </w:rPr>
-        <w:t xml:space="preserve">Triage Table: A sortable table showing — Time, Reporter Name, District, AI Category (e.g., Murder, Theft, Assault), AI Priority (CRITICAL/HIGH/MEDIUM/LOW), and the full complaint text.</w:t>
-      </w:r>
-    </w:p>
-    <w:p>
-      <w:pPr>
-        <w:pStyle w:val="ListParagraph"/>
-        <w:numPr>
-          <w:ilvl w:val="0"/>
-          <w:numId w:val="1"/>
-        </w:numPr>
-        <w:spacing w:after="80"/>
-      </w:pPr>
-      <w:r>
-        <w:rPr>
-          <w:rFonts w:ascii="Calibri" w:cs="Calibri" w:eastAsia="Calibri" w:hAnsi="Calibri"/>
-          <w:color w:val="475569"/>
-          <w:sz w:val="21"/>
-          <w:szCs w:val="21"/>
-        </w:rPr>
-        <w:t xml:space="preserve">Color-Coded Badges: CRITICAL = red flashing badge, HIGH = yellow, MEDIUM = blue, LOW = green.</w:t>
-      </w:r>
-    </w:p>
-    <w:p>
-      <w:pPr>
-        <w:pStyle w:val="ListParagraph"/>
-        <w:numPr>
-          <w:ilvl w:val="0"/>
-          <w:numId w:val="1"/>
-        </w:numPr>
-        <w:spacing w:after="80"/>
-      </w:pPr>
-      <w:r>
-        <w:rPr>
-          <w:rFonts w:ascii="Calibri" w:cs="Calibri" w:eastAsia="Calibri" w:hAnsi="Calibri"/>
-          <w:color w:val="475569"/>
-          <w:sz w:val="21"/>
-          <w:szCs w:val="21"/>
-        </w:rPr>
-        <w:t xml:space="preserve">Auto-Sort Logic: The table is automatically sorted with CRITICAL at the top, then HIGH, then MEDIUM, then LOW.</w:t>
+        <w:t xml:space="preserve">News Cards: Each news article is displayed as a card with the headline, source name, publication time, a snippet, and a "Read Full Article" link.</w:t>
+      </w:r>
+    </w:p>
+    <w:p>
+      <w:pPr>
+        <w:pStyle w:val="ListParagraph"/>
+        <w:numPr>
+          <w:ilvl w:val="0"/>
+          <w:numId w:val="1"/>
+        </w:numPr>
+        <w:spacing w:after="80"/>
+      </w:pPr>
+      <w:r>
+        <w:rPr>
+          <w:rFonts w:ascii="Calibri" w:cs="Calibri" w:eastAsia="Calibri" w:hAnsi="Calibri"/>
+          <w:color w:val="475569"/>
+          <w:sz w:val="21"/>
+          <w:szCs w:val="21"/>
+        </w:rPr>
+        <w:t xml:space="preserve">Multi-Source Aggregation: News is pulled from GNews API, NewsData.io API, NewsAPI.org, and the BBC News API.</w:t>
+      </w:r>
+    </w:p>
+    <w:p>
+      <w:pPr>
+        <w:pStyle w:val="ListParagraph"/>
+        <w:numPr>
+          <w:ilvl w:val="0"/>
+          <w:numId w:val="1"/>
+        </w:numPr>
+        <w:spacing w:after="80"/>
+      </w:pPr>
+      <w:r>
+        <w:rPr>
+          <w:rFonts w:ascii="Calibri" w:cs="Calibri" w:eastAsia="Calibri" w:hAnsi="Calibri"/>
+          <w:color w:val="475569"/>
+          <w:sz w:val="21"/>
+          <w:szCs w:val="21"/>
+        </w:rPr>
+        <w:t xml:space="preserve">Auto-Refresh: The page can be manually refreshed to pull the latest articles.</w:t>
       </w:r>
     </w:p>
     <w:p>
@@ -2733,13 +2662,30 @@
           <w:sz w:val="21"/>
           <w:szCs w:val="21"/>
         </w:rPr>
-        <w:t xml:space="preserve">A police dispatcher monitors this page in real-time. When a new CRITICAL complaint appears, they immediately dispatch emergency responders to the reported location without having to manually read and categorize hundreds of complaints.</w:t>
-      </w:r>
-    </w:p>
-    <w:p>
-      <w:pPr>
-        <w:spacing w:after="100"/>
-      </w:pPr>
+        <w:t xml:space="preserve">An intelligence analyst would keep this page open alongside the Dashboard to stay informed about developing crime situations across India in real-time.</w:t>
+      </w:r>
+    </w:p>
+    <w:p>
+      <w:pPr>
+        <w:spacing w:after="100"/>
+      </w:pPr>
+    </w:p>
+    <w:p>
+      <w:pPr>
+        <w:pStyle w:val="Heading1"/>
+        <w:spacing w:after="200" w:before="400"/>
+      </w:pPr>
+      <w:r>
+        <w:rPr>
+          <w:rFonts w:ascii="Calibri" w:cs="Calibri" w:eastAsia="Calibri" w:hAnsi="Calibri"/>
+          <w:b/>
+          <w:bCs/>
+          <w:color w:val="2563EB"/>
+          <w:sz w:val="32"/>
+          <w:szCs w:val="32"/>
+        </w:rPr>
+        <w:t xml:space="preserve">5. Machine Learning Models Used</w:t>
+      </w:r>
     </w:p>
     <w:p>
       <w:pPr>
@@ -2758,166 +2704,88 @@
           <w:sz w:val="26"/>
           <w:szCs w:val="26"/>
         </w:rPr>
-        <w:t xml:space="preserve">4.9 — Live News Feed Page</w:t>
-      </w:r>
-    </w:p>
-    <w:p>
-      <w:pPr>
-        <w:pStyle w:val="Heading3"/>
-        <w:spacing w:after="100" w:before="200"/>
-      </w:pPr>
-      <w:r>
-        <w:rPr>
-          <w:rFonts w:ascii="Calibri" w:cs="Calibri" w:eastAsia="Calibri" w:hAnsi="Calibri"/>
-          <w:b/>
-          <w:bCs/>
-          <w:color w:val="2563EB"/>
-          <w:sz w:val="22"/>
-          <w:szCs w:val="22"/>
-        </w:rPr>
-        <w:t xml:space="preserve">Why This Page Exists</w:t>
-      </w:r>
-    </w:p>
-    <w:p>
-      <w:pPr>
-        <w:spacing w:after="120"/>
-      </w:pPr>
-      <w:r>
-        <w:rPr>
-          <w:rFonts w:ascii="Calibri" w:cs="Calibri" w:eastAsia="Calibri" w:hAnsi="Calibri"/>
-          <w:color w:val="475569"/>
-          <w:sz w:val="21"/>
-          <w:szCs w:val="21"/>
-        </w:rPr>
-        <w:t xml:space="preserve">Intelligence agencies need real-time situational awareness. This page provides a continuously updated feed of crime-related news from multiple global and Indian news sources.</w:t>
-      </w:r>
-    </w:p>
-    <w:p>
-      <w:pPr>
-        <w:pStyle w:val="Heading3"/>
-        <w:spacing w:after="100" w:before="200"/>
-      </w:pPr>
-      <w:r>
-        <w:rPr>
-          <w:rFonts w:ascii="Calibri" w:cs="Calibri" w:eastAsia="Calibri" w:hAnsi="Calibri"/>
-          <w:b/>
-          <w:bCs/>
-          <w:color w:val="2563EB"/>
-          <w:sz w:val="22"/>
-          <w:szCs w:val="22"/>
-        </w:rPr>
-        <w:t xml:space="preserve">What Is On This Page</w:t>
-      </w:r>
-    </w:p>
-    <w:p>
-      <w:pPr>
-        <w:pStyle w:val="ListParagraph"/>
-        <w:numPr>
-          <w:ilvl w:val="0"/>
-          <w:numId w:val="1"/>
-        </w:numPr>
-        <w:spacing w:after="80"/>
-      </w:pPr>
-      <w:r>
-        <w:rPr>
-          <w:rFonts w:ascii="Calibri" w:cs="Calibri" w:eastAsia="Calibri" w:hAnsi="Calibri"/>
-          <w:color w:val="475569"/>
-          <w:sz w:val="21"/>
-          <w:szCs w:val="21"/>
-        </w:rPr>
-        <w:t xml:space="preserve">News Cards: Each news article is displayed as a card with the headline, source name, publication time, a snippet, and a "Read Full Article" link.</w:t>
-      </w:r>
-    </w:p>
-    <w:p>
-      <w:pPr>
-        <w:pStyle w:val="ListParagraph"/>
-        <w:numPr>
-          <w:ilvl w:val="0"/>
-          <w:numId w:val="1"/>
-        </w:numPr>
-        <w:spacing w:after="80"/>
-      </w:pPr>
-      <w:r>
-        <w:rPr>
-          <w:rFonts w:ascii="Calibri" w:cs="Calibri" w:eastAsia="Calibri" w:hAnsi="Calibri"/>
-          <w:color w:val="475569"/>
-          <w:sz w:val="21"/>
-          <w:szCs w:val="21"/>
-        </w:rPr>
-        <w:t xml:space="preserve">Multi-Source Aggregation: News is pulled from GNews API, NewsData.io API, NewsAPI.org, and the BBC News API.</w:t>
-      </w:r>
-    </w:p>
-    <w:p>
-      <w:pPr>
-        <w:pStyle w:val="ListParagraph"/>
-        <w:numPr>
-          <w:ilvl w:val="0"/>
-          <w:numId w:val="1"/>
-        </w:numPr>
-        <w:spacing w:after="80"/>
-      </w:pPr>
-      <w:r>
-        <w:rPr>
-          <w:rFonts w:ascii="Calibri" w:cs="Calibri" w:eastAsia="Calibri" w:hAnsi="Calibri"/>
-          <w:color w:val="475569"/>
-          <w:sz w:val="21"/>
-          <w:szCs w:val="21"/>
-        </w:rPr>
-        <w:t xml:space="preserve">Auto-Refresh: The page can be manually refreshed to pull the latest articles.</w:t>
-      </w:r>
-    </w:p>
-    <w:p>
-      <w:pPr>
-        <w:pStyle w:val="Heading3"/>
-        <w:spacing w:after="100" w:before="200"/>
-      </w:pPr>
-      <w:r>
-        <w:rPr>
-          <w:rFonts w:ascii="Calibri" w:cs="Calibri" w:eastAsia="Calibri" w:hAnsi="Calibri"/>
-          <w:b/>
-          <w:bCs/>
-          <w:color w:val="2563EB"/>
-          <w:sz w:val="22"/>
-          <w:szCs w:val="22"/>
-        </w:rPr>
-        <w:t xml:space="preserve">What It Is Used For</w:t>
-      </w:r>
-    </w:p>
-    <w:p>
-      <w:pPr>
-        <w:spacing w:after="120"/>
-      </w:pPr>
-      <w:r>
-        <w:rPr>
-          <w:rFonts w:ascii="Calibri" w:cs="Calibri" w:eastAsia="Calibri" w:hAnsi="Calibri"/>
-          <w:color w:val="475569"/>
-          <w:sz w:val="21"/>
-          <w:szCs w:val="21"/>
-        </w:rPr>
-        <w:t xml:space="preserve">An intelligence analyst would keep this page open alongside the Dashboard to stay informed about developing crime situations across India in real-time.</w:t>
-      </w:r>
-    </w:p>
-    <w:p>
-      <w:pPr>
-        <w:spacing w:after="100"/>
-      </w:pPr>
-    </w:p>
-    <w:p>
-      <w:pPr>
-        <w:pStyle w:val="Heading1"/>
-        <w:spacing w:after="200" w:before="400"/>
-      </w:pPr>
-      <w:r>
-        <w:rPr>
-          <w:rFonts w:ascii="Calibri" w:cs="Calibri" w:eastAsia="Calibri" w:hAnsi="Calibri"/>
-          <w:b/>
-          <w:bCs/>
-          <w:color w:val="2563EB"/>
-          <w:sz w:val="32"/>
-          <w:szCs w:val="32"/>
-        </w:rPr>
-        <w:t xml:space="preserve">5. Machine Learning Models Used</w:t>
-      </w:r>
+        <w:t xml:space="preserve">5.1 — Random Forest Regressor</w:t>
+      </w:r>
+    </w:p>
+    <w:p>
+      <w:pPr>
+        <w:spacing w:after="120"/>
+      </w:pPr>
+      <w:r>
+        <w:rPr>
+          <w:rFonts w:ascii="Calibri" w:cs="Calibri" w:eastAsia="Calibri" w:hAnsi="Calibri"/>
+          <w:b/>
+          <w:bCs/>
+          <w:color w:val="0F172A"/>
+          <w:sz w:val="21"/>
+          <w:szCs w:val="21"/>
+        </w:rPr>
+        <w:t xml:space="preserve">Purpose: </w:t>
+      </w:r>
+      <w:r>
+        <w:rPr>
+          <w:rFonts w:ascii="Calibri" w:cs="Calibri" w:eastAsia="Calibri" w:hAnsi="Calibri"/>
+          <w:color w:val="475569"/>
+          <w:sz w:val="21"/>
+          <w:szCs w:val="21"/>
+        </w:rPr>
+        <w:t xml:space="preserve">Predicts future crime counts for each state.</w:t>
+      </w:r>
+    </w:p>
+    <w:p>
+      <w:pPr>
+        <w:spacing w:after="120"/>
+      </w:pPr>
+      <w:r>
+        <w:rPr>
+          <w:rFonts w:ascii="Calibri" w:cs="Calibri" w:eastAsia="Calibri" w:hAnsi="Calibri"/>
+          <w:b/>
+          <w:bCs/>
+          <w:color w:val="0F172A"/>
+          <w:sz w:val="21"/>
+          <w:szCs w:val="21"/>
+        </w:rPr>
+        <w:t xml:space="preserve">How It Works: </w:t>
+      </w:r>
+      <w:r>
+        <w:rPr>
+          <w:rFonts w:ascii="Calibri" w:cs="Calibri" w:eastAsia="Calibri" w:hAnsi="Calibri"/>
+          <w:color w:val="475569"/>
+          <w:sz w:val="21"/>
+          <w:szCs w:val="21"/>
+        </w:rPr>
+        <w:t xml:space="preserve">A Random Forest is an ensemble of many decision trees. Each tree is trained on a random subset of the data. The final prediction is the average of all trees' predictions. This reduces overfitting and improves accuracy.</w:t>
+      </w:r>
+    </w:p>
+    <w:p>
+      <w:pPr>
+        <w:spacing w:after="120"/>
+      </w:pPr>
+      <w:r>
+        <w:rPr>
+          <w:rFonts w:ascii="Calibri" w:cs="Calibri" w:eastAsia="Calibri" w:hAnsi="Calibri"/>
+          <w:b/>
+          <w:bCs/>
+          <w:color w:val="0F172A"/>
+          <w:sz w:val="21"/>
+          <w:szCs w:val="21"/>
+        </w:rPr>
+        <w:t xml:space="preserve">Library: </w:t>
+      </w:r>
+      <w:r>
+        <w:rPr>
+          <w:rFonts w:ascii="Calibri" w:cs="Calibri" w:eastAsia="Calibri" w:hAnsi="Calibri"/>
+          <w:color w:val="475569"/>
+          <w:sz w:val="21"/>
+          <w:szCs w:val="21"/>
+        </w:rPr>
+        <w:t xml:space="preserve">scikit-learn (RandomForestRegressor)</w:t>
+      </w:r>
+    </w:p>
+    <w:p>
+      <w:pPr>
+        <w:spacing w:after="100"/>
+      </w:pPr>
     </w:p>
     <w:p>
       <w:pPr>
@@ -2936,7 +2804,7 @@
           <w:sz w:val="26"/>
           <w:szCs w:val="26"/>
         </w:rPr>
-        <w:t xml:space="preserve">5.1 — Random Forest Regressor</w:t>
+        <w:t xml:space="preserve">5.2 — Linear Regression</w:t>
       </w:r>
     </w:p>
     <w:p>
@@ -2961,7 +2829,7 @@
           <w:sz w:val="21"/>
           <w:szCs w:val="21"/>
         </w:rPr>
-        <w:t xml:space="preserve">Predicts future crime counts for each state.</w:t>
+        <w:t xml:space="preserve">Provides a secondary, simpler prediction as a baseline comparison.</w:t>
       </w:r>
     </w:p>
     <w:p>
@@ -2986,7 +2854,7 @@
           <w:sz w:val="21"/>
           <w:szCs w:val="21"/>
         </w:rPr>
-        <w:t xml:space="preserve">A Random Forest is an ensemble of many decision trees. Each tree is trained on a random subset of the data. The final prediction is the average of all trees' predictions. This reduces overfitting and improves accuracy.</w:t>
+        <w:t xml:space="preserve">Fits a straight line through the historical data points to project the trend forward. It is less accurate than Random Forest but provides a useful "sanity check."</w:t>
       </w:r>
     </w:p>
     <w:p>
@@ -3011,7 +2879,7 @@
           <w:sz w:val="21"/>
           <w:szCs w:val="21"/>
         </w:rPr>
-        <w:t xml:space="preserve">scikit-learn (RandomForestRegressor)</w:t>
+        <w:t xml:space="preserve">scikit-learn (LinearRegression)</w:t>
       </w:r>
     </w:p>
     <w:p>
@@ -3036,7 +2904,7 @@
           <w:sz w:val="26"/>
           <w:szCs w:val="26"/>
         </w:rPr>
-        <w:t xml:space="preserve">5.2 — Linear Regression</w:t>
+        <w:t xml:space="preserve">5.3 — K-Means Clustering</w:t>
       </w:r>
     </w:p>
     <w:p>
@@ -3061,7 +2929,7 @@
           <w:sz w:val="21"/>
           <w:szCs w:val="21"/>
         </w:rPr>
-        <w:t xml:space="preserve">Provides a secondary, simpler prediction as a baseline comparison.</w:t>
+        <w:t xml:space="preserve">Groups states into safety clusters and assigns Safety Scores (0-100).</w:t>
       </w:r>
     </w:p>
     <w:p>
@@ -3086,7 +2954,7 @@
           <w:sz w:val="21"/>
           <w:szCs w:val="21"/>
         </w:rPr>
-        <w:t xml:space="preserve">Fits a straight line through the historical data points to project the trend forward. It is less accurate than Random Forest but provides a useful "sanity check."</w:t>
+        <w:t xml:space="preserve">Divides states into groups (clusters) based on their crime statistics. States in the same cluster have similar crime profiles. The algorithm assigns a score inversely proportional to crime density.</w:t>
       </w:r>
     </w:p>
     <w:p>
@@ -3111,207 +2979,7 @@
           <w:sz w:val="21"/>
           <w:szCs w:val="21"/>
         </w:rPr>
-        <w:t xml:space="preserve">scikit-learn (LinearRegression)</w:t>
-      </w:r>
-    </w:p>
-    <w:p>
-      <w:pPr>
-        <w:spacing w:after="100"/>
-      </w:pPr>
-    </w:p>
-    <w:p>
-      <w:pPr>
-        <w:pStyle w:val="Heading2"/>
-        <w:pBdr>
-          <w:bottom w:val="single" w:color="E2E8F0" w:sz="1"/>
-        </w:pBdr>
-        <w:spacing w:after="150" w:before="300"/>
-      </w:pPr>
-      <w:r>
-        <w:rPr>
-          <w:rFonts w:ascii="Calibri" w:cs="Calibri" w:eastAsia="Calibri" w:hAnsi="Calibri"/>
-          <w:b/>
-          <w:bCs/>
-          <w:color w:val="0F172A"/>
-          <w:sz w:val="26"/>
-          <w:szCs w:val="26"/>
-        </w:rPr>
-        <w:t xml:space="preserve">5.3 — K-Means Clustering</w:t>
-      </w:r>
-    </w:p>
-    <w:p>
-      <w:pPr>
-        <w:spacing w:after="120"/>
-      </w:pPr>
-      <w:r>
-        <w:rPr>
-          <w:rFonts w:ascii="Calibri" w:cs="Calibri" w:eastAsia="Calibri" w:hAnsi="Calibri"/>
-          <w:b/>
-          <w:bCs/>
-          <w:color w:val="0F172A"/>
-          <w:sz w:val="21"/>
-          <w:szCs w:val="21"/>
-        </w:rPr>
-        <w:t xml:space="preserve">Purpose: </w:t>
-      </w:r>
-      <w:r>
-        <w:rPr>
-          <w:rFonts w:ascii="Calibri" w:cs="Calibri" w:eastAsia="Calibri" w:hAnsi="Calibri"/>
-          <w:color w:val="475569"/>
-          <w:sz w:val="21"/>
-          <w:szCs w:val="21"/>
-        </w:rPr>
-        <w:t xml:space="preserve">Groups states into safety clusters and assigns Safety Scores (0-100).</w:t>
-      </w:r>
-    </w:p>
-    <w:p>
-      <w:pPr>
-        <w:spacing w:after="120"/>
-      </w:pPr>
-      <w:r>
-        <w:rPr>
-          <w:rFonts w:ascii="Calibri" w:cs="Calibri" w:eastAsia="Calibri" w:hAnsi="Calibri"/>
-          <w:b/>
-          <w:bCs/>
-          <w:color w:val="0F172A"/>
-          <w:sz w:val="21"/>
-          <w:szCs w:val="21"/>
-        </w:rPr>
-        <w:t xml:space="preserve">How It Works: </w:t>
-      </w:r>
-      <w:r>
-        <w:rPr>
-          <w:rFonts w:ascii="Calibri" w:cs="Calibri" w:eastAsia="Calibri" w:hAnsi="Calibri"/>
-          <w:color w:val="475569"/>
-          <w:sz w:val="21"/>
-          <w:szCs w:val="21"/>
-        </w:rPr>
-        <w:t xml:space="preserve">Divides states into groups (clusters) based on their crime statistics. States in the same cluster have similar crime profiles. The algorithm assigns a score inversely proportional to crime density.</w:t>
-      </w:r>
-    </w:p>
-    <w:p>
-      <w:pPr>
-        <w:spacing w:after="120"/>
-      </w:pPr>
-      <w:r>
-        <w:rPr>
-          <w:rFonts w:ascii="Calibri" w:cs="Calibri" w:eastAsia="Calibri" w:hAnsi="Calibri"/>
-          <w:b/>
-          <w:bCs/>
-          <w:color w:val="0F172A"/>
-          <w:sz w:val="21"/>
-          <w:szCs w:val="21"/>
-        </w:rPr>
-        <w:t xml:space="preserve">Library: </w:t>
-      </w:r>
-      <w:r>
-        <w:rPr>
-          <w:rFonts w:ascii="Calibri" w:cs="Calibri" w:eastAsia="Calibri" w:hAnsi="Calibri"/>
-          <w:color w:val="475569"/>
-          <w:sz w:val="21"/>
-          <w:szCs w:val="21"/>
-        </w:rPr>
         <w:t xml:space="preserve">scikit-learn (KMeans)</w:t>
-      </w:r>
-    </w:p>
-    <w:p>
-      <w:pPr>
-        <w:spacing w:after="100"/>
-      </w:pPr>
-    </w:p>
-    <w:p>
-      <w:pPr>
-        <w:pStyle w:val="Heading2"/>
-        <w:pBdr>
-          <w:bottom w:val="single" w:color="E2E8F0" w:sz="1"/>
-        </w:pBdr>
-        <w:spacing w:after="150" w:before="300"/>
-      </w:pPr>
-      <w:r>
-        <w:rPr>
-          <w:rFonts w:ascii="Calibri" w:cs="Calibri" w:eastAsia="Calibri" w:hAnsi="Calibri"/>
-          <w:b/>
-          <w:bCs/>
-          <w:color w:val="0F172A"/>
-          <w:sz w:val="26"/>
-          <w:szCs w:val="26"/>
-        </w:rPr>
-        <w:t xml:space="preserve">5.4 — Multinomial Naive Bayes (NLP)</w:t>
-      </w:r>
-    </w:p>
-    <w:p>
-      <w:pPr>
-        <w:spacing w:after="120"/>
-      </w:pPr>
-      <w:r>
-        <w:rPr>
-          <w:rFonts w:ascii="Calibri" w:cs="Calibri" w:eastAsia="Calibri" w:hAnsi="Calibri"/>
-          <w:b/>
-          <w:bCs/>
-          <w:color w:val="0F172A"/>
-          <w:sz w:val="21"/>
-          <w:szCs w:val="21"/>
-        </w:rPr>
-        <w:t xml:space="preserve">Purpose: </w:t>
-      </w:r>
-      <w:r>
-        <w:rPr>
-          <w:rFonts w:ascii="Calibri" w:cs="Calibri" w:eastAsia="Calibri" w:hAnsi="Calibri"/>
-          <w:color w:val="475569"/>
-          <w:sz w:val="21"/>
-          <w:szCs w:val="21"/>
-        </w:rPr>
-        <w:t xml:space="preserve">Classifies citizen complaint text into crime categories and assigns priority levels.</w:t>
-      </w:r>
-    </w:p>
-    <w:p>
-      <w:pPr>
-        <w:spacing w:after="120"/>
-      </w:pPr>
-      <w:r>
-        <w:rPr>
-          <w:rFonts w:ascii="Calibri" w:cs="Calibri" w:eastAsia="Calibri" w:hAnsi="Calibri"/>
-          <w:b/>
-          <w:bCs/>
-          <w:color w:val="0F172A"/>
-          <w:sz w:val="21"/>
-          <w:szCs w:val="21"/>
-        </w:rPr>
-        <w:t xml:space="preserve">How It Works: </w:t>
-      </w:r>
-      <w:r>
-        <w:rPr>
-          <w:rFonts w:ascii="Calibri" w:cs="Calibri" w:eastAsia="Calibri" w:hAnsi="Calibri"/>
-          <w:color w:val="475569"/>
-          <w:sz w:val="21"/>
-          <w:szCs w:val="21"/>
-        </w:rPr>
-        <w:t xml:space="preserve">The text is converted into numerical features using TF-IDF Vectorization, then the Naive Bayes classifier calculates the probability of each crime category. The highest probability category wins.</w:t>
-      </w:r>
-    </w:p>
-    <w:p>
-      <w:pPr>
-        <w:spacing w:after="120"/>
-      </w:pPr>
-      <w:r>
-        <w:rPr>
-          <w:rFonts w:ascii="Calibri" w:cs="Calibri" w:eastAsia="Calibri" w:hAnsi="Calibri"/>
-          <w:b/>
-          <w:bCs/>
-          <w:color w:val="0F172A"/>
-          <w:sz w:val="21"/>
-          <w:szCs w:val="21"/>
-        </w:rPr>
-        <w:t xml:space="preserve">Library: </w:t>
-      </w:r>
-      <w:r>
-        <w:rPr>
-          <w:rFonts w:ascii="Calibri" w:cs="Calibri" w:eastAsia="Calibri" w:hAnsi="Calibri"/>
-          <w:color w:val="475569"/>
-          <w:sz w:val="21"/>
-          <w:szCs w:val="21"/>
-        </w:rPr>
-        <w:t xml:space="preserve">scikit-learn (MultinomialNB + TfidfVectorizer)</w:t>
       </w:r>
     </w:p>
     <w:p>

</xml_diff>